<commit_message>
Notes requirements: the list is about five lines high and scrolls; a note shows two lines, click for the rest
Co-Authored-By: Claude Opus 5.5 <noreply@anthropic.com>
</commit_message>
<xml_diff>
--- a/NOTES_REQUIREMENTS.docx
+++ b/NOTES_REQUIREMENTS.docx
@@ -619,19 +619,64 @@
         <w:rPr>
           <w:b w:val="0"/>
         </w:rPr>
-        <w:t xml:space="preserve">A long list shows the latest five; </w:t>
+        <w:t xml:space="preserve">The Notes section never takes over the page (Boaz, 2026-10-13): the list is about </w:t>
       </w:r>
       <w:r>
         <w:rPr>
           <w:b/>
         </w:rPr>
-        <w:t>Show all</w:t>
+        <w:t>five lines high</w:t>
+      </w:r>
+    </w:p>
+    <w:p>
+      <w:r>
+        <w:rPr>
+          <w:b w:val="0"/>
+        </w:rPr>
+        <w:t xml:space="preserve">   and </w:t>
+      </w:r>
+      <w:r>
+        <w:rPr>
+          <w:b/>
+        </w:rPr>
+        <w:t>scrolls</w:t>
       </w:r>
       <w:r>
         <w:rPr>
           <w:b w:val="0"/>
         </w:rPr>
-        <w:t xml:space="preserve"> opens the rest.</w:t>
+        <w:t xml:space="preserve"> to show older notes.</w:t>
+      </w:r>
+    </w:p>
+    <w:p>
+      <w:pPr>
+        <w:pStyle w:val="ListNumber"/>
+      </w:pPr>
+      <w:r>
+        <w:rPr>
+          <w:b w:val="0"/>
+        </w:rPr>
+        <w:t xml:space="preserve">A single note takes </w:t>
+      </w:r>
+      <w:r>
+        <w:rPr>
+          <w:b/>
+        </w:rPr>
+        <w:t>at most two lines</w:t>
+      </w:r>
+      <w:r>
+        <w:rPr>
+          <w:b w:val="0"/>
+        </w:rPr>
+        <w:t xml:space="preserve"> in the list. A longer note is cut off there, and a **click</w:t>
+      </w:r>
+    </w:p>
+    <w:p>
+      <w:r>
+        <w:rPr>
+          <w:b w:val="0"/>
+        </w:rPr>
+        <w:t xml:space="preserve">   shows the whole note** — the same way the long text fields in the dashboard tables open.</w:t>
       </w:r>
     </w:p>
     <w:p>

</xml_diff>

<commit_message>
Notes requirements: the list shows the four latest notes without scrolling
Co-Authored-By: Claude Opus 5.5 <noreply@anthropic.com>
</commit_message>
<xml_diff>
--- a/NOTES_REQUIREMENTS.docx
+++ b/NOTES_REQUIREMENTS.docx
@@ -619,13 +619,7 @@
         <w:rPr>
           <w:b w:val="0"/>
         </w:rPr>
-        <w:t xml:space="preserve">The Notes section never takes over the page (Boaz, 2026-10-13): the list is about </w:t>
-      </w:r>
-      <w:r>
-        <w:rPr>
-          <w:b/>
-        </w:rPr>
-        <w:t>five lines high</w:t>
+        <w:t>The Notes section never takes over the page (Boaz, 2026-10-13): the list is high enough to</w:t>
       </w:r>
     </w:p>
     <w:p>
@@ -633,7 +627,27 @@
         <w:rPr>
           <w:b w:val="0"/>
         </w:rPr>
-        <w:t xml:space="preserve">   and </w:t>
+        <w:t xml:space="preserve">   show </w:t>
+      </w:r>
+      <w:r>
+        <w:rPr>
+          <w:b/>
+        </w:rPr>
+        <w:t>the four latest notes without scrolling</w:t>
+      </w:r>
+      <w:r>
+        <w:rPr>
+          <w:b w:val="0"/>
+        </w:rPr>
+        <w:t xml:space="preserve"> (about eight lines, as a note takes up to two) and</w:t>
+      </w:r>
+    </w:p>
+    <w:p>
+      <w:r>
+        <w:rPr>
+          <w:b w:val="0"/>
+        </w:rPr>
+        <w:t xml:space="preserve">   </w:t>
       </w:r>
       <w:r>
         <w:rPr>

</xml_diff>

<commit_message>
Notes: design (agreed 2026-10-13, D1-D8); requirements R6.3 corrected, R6.4-R6.5 added
Co-Authored-By: Claude Opus 5.5 <noreply@anthropic.com>
</commit_message>
<xml_diff>
--- a/NOTES_REQUIREMENTS.docx
+++ b/NOTES_REQUIREMENTS.docx
@@ -1080,7 +1080,7 @@
         <w:rPr>
           <w:b w:val="0"/>
         </w:rPr>
-        <w:t>Notes are sent to the AI service only in these two cases, with the user's own API key, exactly like</w:t>
+        <w:t>Notes are sent to the AI service only when the user uses the Sales Mentor or a message draft, with the</w:t>
       </w:r>
     </w:p>
     <w:p>
@@ -1088,7 +1088,77 @@
         <w:rPr>
           <w:b w:val="0"/>
         </w:rPr>
-        <w:t xml:space="preserve">   the account data that is already sent today. Help and the privacy text say so.</w:t>
+        <w:t xml:space="preserve">   user's own API key. For the Mentor on a lead and for drafts, notes are the first text about the account</w:t>
+      </w:r>
+    </w:p>
+    <w:p>
+      <w:r>
+        <w:rPr>
+          <w:b w:val="0"/>
+        </w:rPr>
+        <w:t xml:space="preserve">   that is sent (today they are given only the lead itself). Help and the privacy text say so.</w:t>
+      </w:r>
+    </w:p>
+    <w:p>
+      <w:r>
+        <w:rPr>
+          <w:b w:val="0"/>
+        </w:rPr>
+        <w:t xml:space="preserve">   (Corrected 2026-10-13 after the code review; design decision D6.)</w:t>
+      </w:r>
+    </w:p>
+    <w:p>
+      <w:pPr>
+        <w:pStyle w:val="ListNumber"/>
+      </w:pPr>
+      <w:r>
+        <w:rPr>
+          <w:b w:val="0"/>
+        </w:rPr>
+        <w:t xml:space="preserve">The Sales Mentor chats on the </w:t>
+      </w:r>
+      <w:r>
+        <w:rPr>
+          <w:b/>
+        </w:rPr>
+        <w:t>account page</w:t>
+      </w:r>
+      <w:r>
+        <w:rPr>
+          <w:b w:val="0"/>
+        </w:rPr>
+        <w:t xml:space="preserve"> and the </w:t>
+      </w:r>
+      <w:r>
+        <w:rPr>
+          <w:b/>
+        </w:rPr>
+        <w:t>contact page</w:t>
+      </w:r>
+      <w:r>
+        <w:rPr>
+          <w:b w:val="0"/>
+        </w:rPr>
+        <w:t xml:space="preserve"> read the notes too (design</w:t>
+      </w:r>
+    </w:p>
+    <w:p>
+      <w:r>
+        <w:rPr>
+          <w:b w:val="0"/>
+        </w:rPr>
+        <w:t xml:space="preserve">   decision D5, agreed 2026-10-13).</w:t>
+      </w:r>
+    </w:p>
+    <w:p>
+      <w:pPr>
+        <w:pStyle w:val="ListNumber"/>
+      </w:pPr>
+      <w:r>
+        <w:rPr>
+          <w:b w:val="0"/>
+        </w:rPr>
+        <w:t>In a prompt a note is cut at 500 characters (design decision D7).</w:t>
       </w:r>
     </w:p>
     <w:p>

</xml_diff>